<commit_message>
Add Atlas Global Retail and HR Attrition Power BI projects to the CV
</commit_message>
<xml_diff>
--- a/Emmanuel_Omowumi_Data_Analyst_CV.docx
+++ b/Emmanuel_Omowumi_Data_Analyst_CV.docx
@@ -124,7 +124,7 @@
           <w:color w:val="1F2933"/>
           <w:sz w:val="19"/>
         </w:rPr>
-        <w:t>Data analyst with 3+ years of experience in business intelligence, SQL reporting and dashboard development, now working in sales analytics. M.Sc. in Microbiology, with earlier experience in laboratory and quality assurance, which built a habit of validating data, tracing deviations to root cause and reporting clearly to management. Builds end-to-end analytics projects on Nigerian data (inflation, payments, distribution, customer reviews) with tested code, stated limitations and recommendations a decision-maker can act on.</w:t>
+        <w:t>Data analyst with 3+ years of experience in business intelligence, SQL reporting and dashboard development, now working in sales analytics. M.Sc. in Microbiology, with earlier experience in laboratory and quality assurance, which built a habit of validating data, tracing deviations to root cause and reporting clearly to management. Builds end-to-end analytics projects on Nigerian data (inflation, payments, distribution, customer reviews) and Power BI case studies in retail and HR, with tested code, stated limitations and costed recommendations a decision-maker can act on.</w:t>
       </w:r>
     </w:p>
     <w:p>
@@ -517,7 +517,7 @@
           <w:color w:val="5F6B7A"/>
           <w:sz w:val="18"/>
         </w:rPr>
-        <w:t>Portfolio of 8 projects with code, tests and write-ups: github.com/Nuelwumi2024</w:t>
+        <w:t>Portfolio of 10 projects with code, tests and write-ups: github.com/Nuelwumi2024</w:t>
       </w:r>
     </w:p>
     <w:p>
@@ -729,7 +729,7 @@
           <w:b/>
           <w:sz w:val="20"/>
         </w:rPr>
-        <w:t>Naira Payments ETL Pipeline (synthetic data)</w:t>
+        <w:t>Atlas Global Retail: Sales and Profitability Analysis (Power BI, synthetic data)</w:t>
       </w:r>
       <w:r>
         <w:rPr>
@@ -737,7 +737,7 @@
           <w:color w:val="5F6B7A"/>
           <w:sz w:val="18"/>
         </w:rPr>
-        <w:t xml:space="preserve">  |  Python, DuckDB, SQL, Airflow, pytest, GitHub Actions</w:t>
+        <w:t xml:space="preserve">  |  Power BI, DAX, Power Query, star-schema modelling, Python</w:t>
       </w:r>
     </w:p>
     <w:p>
@@ -750,7 +750,20 @@
         <w:rPr>
           <w:sz w:val="19"/>
         </w:rPr>
-        <w:t>Built a batch ETL with a star schema that processed 117,891 raw records, quarantined 1,051 bad rows with reasons and removed 703 duplicates; the run fails unless row counts reconcile.</w:t>
+        <w:t>Built a four-page Power BI report (star schema, DAX measures, budget-vs-actual) on 9,818 order lines to explain why sales grew 43% while profit grew 6%; sales were within 1% of target but profit was 16% short.</w:t>
+      </w:r>
+    </w:p>
+    <w:p>
+      <w:pPr>
+        <w:pStyle w:val="ListBullet"/>
+        <w:spacing w:after="30"/>
+        <w:ind w:left="312" w:hanging="227"/>
+      </w:pPr>
+      <w:r>
+        <w:rPr>
+          <w:sz w:val="19"/>
+        </w:rPr>
+        <w:t>Traced the gap to discounting: lines discounted 30% or more sold $505K and lost $105K, and the average discount rose from 10.8% to 14.5%. Estimated that a 20% discount cap adds about $125K of profit (+26%) with volume held constant.</w:t>
       </w:r>
     </w:p>
     <w:p>
@@ -764,7 +777,7 @@
             <w:color w:val="1F4E79"/>
             <w:sz w:val="17"/>
           </w:rPr>
-          <w:t xml:space="preserve">github.com/Nuelwumi2024/naira-payments-etl-pipeline</w:t>
+          <w:t xml:space="preserve">github.com/Nuelwumi2024/powerbi-global-superstore-analysis</w:t>
         </w:r>
       </w:hyperlink>
     </w:p>
@@ -778,7 +791,7 @@
           <w:b/>
           <w:sz w:val="20"/>
         </w:rPr>
-        <w:t>Fintech dbt Analytics Warehouse and Fraud Analysis (synthetic data)</w:t>
+        <w:t>HR Attrition and Workforce Analytics (Power BI, synthetic data)</w:t>
       </w:r>
       <w:r>
         <w:rPr>
@@ -786,7 +799,7 @@
           <w:color w:val="5F6B7A"/>
           <w:sz w:val="18"/>
         </w:rPr>
-        <w:t xml:space="preserve">  |  dbt, DuckDB, SQL, Python</w:t>
+        <w:t xml:space="preserve">  |  Power BI, DAX, Power Query, Python</w:t>
       </w:r>
     </w:p>
     <w:p>
@@ -799,7 +812,7 @@
         <w:rPr>
           <w:sz w:val="19"/>
         </w:rPr>
-        <w:t>Built a layered dbt warehouse (8 models, 12 data tests, all passing) with CI running dbt build on every push.</w:t>
+        <w:t>Modelled 1,500 employee records in Power BI with DAX (tenure bands, attrition rate, replacement cost) across three report pages.</w:t>
       </w:r>
     </w:p>
     <w:p>
@@ -812,7 +825,7 @@
         <w:rPr>
           <w:sz w:val="19"/>
         </w:rPr>
-        <w:t>Showed fraud is about 2.9x likelier at night and that four simple rules catch 29% of fraud while reviewing 7.7% of traffic.</w:t>
+        <w:t>Found 27.5% attrition concentrated in Customer Support (49%) and early-tenure staff; overtime lifted attrition from 23% to 38%. Costed it at about $13M and recommended five actions.</w:t>
       </w:r>
     </w:p>
     <w:p>
@@ -826,7 +839,69 @@
             <w:color w:val="1F4E79"/>
             <w:sz w:val="17"/>
           </w:rPr>
-          <w:t xml:space="preserve">github.com/Nuelwumi2024/fintech-dbt-analytics-warehouse</w:t>
+          <w:t xml:space="preserve">github.com/Nuelwumi2024/powerbi-hr-attrition-dashboard</w:t>
+        </w:r>
+      </w:hyperlink>
+    </w:p>
+    <w:p>
+      <w:pPr>
+        <w:keepNext/>
+        <w:spacing w:before="60" w:after="0"/>
+      </w:pPr>
+      <w:r>
+        <w:rPr>
+          <w:b/>
+          <w:sz w:val="20"/>
+        </w:rPr>
+        <w:t>Data Engineering Projects (synthetic data)</w:t>
+      </w:r>
+      <w:r>
+        <w:rPr>
+          <w:i/>
+          <w:color w:val="5F6B7A"/>
+          <w:sz w:val="18"/>
+        </w:rPr>
+        <w:t xml:space="preserve">  |  Python, DuckDB, SQL, dbt, Airflow, pytest, GitHub Actions</w:t>
+      </w:r>
+    </w:p>
+    <w:p>
+      <w:pPr>
+        <w:pStyle w:val="ListBullet"/>
+        <w:spacing w:after="30"/>
+        <w:ind w:left="312" w:hanging="227"/>
+      </w:pPr>
+      <w:r>
+        <w:rPr>
+          <w:sz w:val="19"/>
+        </w:rPr>
+        <w:t>Naira Payments ETL: batch pipeline with a star schema that processed 117,891 raw records, quarantined 1,051 bad rows with reasons and removed 703 duplicates; the run fails unless row counts reconcile.</w:t>
+      </w:r>
+    </w:p>
+    <w:p>
+      <w:pPr>
+        <w:pStyle w:val="ListBullet"/>
+        <w:spacing w:after="30"/>
+        <w:ind w:left="312" w:hanging="227"/>
+      </w:pPr>
+      <w:r>
+        <w:rPr>
+          <w:sz w:val="19"/>
+        </w:rPr>
+        <w:t>Fintech dbt warehouse and fraud analysis: 8 models and 12 passing data tests with CI; showed fraud is about 2.9x likelier at night and that four simple rules catch 29% of fraud while reviewing 7.7% of traffic.</w:t>
+      </w:r>
+    </w:p>
+    <w:p>
+      <w:pPr>
+        <w:ind w:left="85"/>
+      </w:pPr>
+      <w:hyperlink r:id="rId17">
+        <w:r>
+          <w:rPr>
+            <w:rFonts w:ascii="Calibri" w:hAnsi="Calibri"/>
+            <w:color w:val="1F4E79"/>
+            <w:sz w:val="17"/>
+          </w:rPr>
+          <w:t xml:space="preserve">github.com/Nuelwumi2024/naira-payments-etl-pipeline</w:t>
         </w:r>
       </w:hyperlink>
     </w:p>

</xml_diff>

<commit_message>
Add four certifications to the CV
</commit_message>
<xml_diff>
--- a/Emmanuel_Omowumi_Data_Analyst_CV.docx
+++ b/Emmanuel_Omowumi_Data_Analyst_CV.docx
@@ -1018,7 +1018,46 @@
         <w:rPr>
           <w:sz w:val="19"/>
         </w:rPr>
-        <w:t>Advanced Data Analytics 2025 (Excel, SQL, Power BI, Python)</w:t>
+        <w:t>Data Analysis and Business Intelligence with Microsoft Excel, Udemy (March 2026 - Present)</w:t>
+      </w:r>
+    </w:p>
+    <w:p>
+      <w:pPr>
+        <w:pStyle w:val="ListBullet"/>
+        <w:spacing w:after="30"/>
+        <w:ind w:left="312" w:hanging="227"/>
+      </w:pPr>
+      <w:r>
+        <w:rPr>
+          <w:sz w:val="19"/>
+        </w:rPr>
+        <w:t>Data Analytics Masters Certifications, Udemy (February 2025 - Present)</w:t>
+      </w:r>
+    </w:p>
+    <w:p>
+      <w:pPr>
+        <w:pStyle w:val="ListBullet"/>
+        <w:spacing w:after="30"/>
+        <w:ind w:left="312" w:hanging="227"/>
+      </w:pPr>
+      <w:r>
+        <w:rPr>
+          <w:sz w:val="19"/>
+        </w:rPr>
+        <w:t>Certified Data Analyst and Scientist (May 2024 - Present)</w:t>
+      </w:r>
+    </w:p>
+    <w:p>
+      <w:pPr>
+        <w:pStyle w:val="ListBullet"/>
+        <w:spacing w:after="30"/>
+        <w:ind w:left="312" w:hanging="227"/>
+      </w:pPr>
+      <w:r>
+        <w:rPr>
+          <w:sz w:val="19"/>
+        </w:rPr>
+        <w:t>Advanced Data Analytics Certifications, Google Data Analytics (April 2024 - Present)</w:t>
       </w:r>
     </w:p>
     <w:p>

</xml_diff>

<commit_message>
Describe SQL generically instead of naming DuckDB
</commit_message>
<xml_diff>
--- a/Emmanuel_Omowumi_Data_Analyst_CV.docx
+++ b/Emmanuel_Omowumi_Data_Analyst_CV.docx
@@ -160,7 +160,7 @@
         <w:rPr>
           <w:sz w:val="19"/>
         </w:rPr>
-        <w:t>SQL (MySQL, SQL Server, DuckDB), Power BI (DAX, Power Query), Tableau, Excel</w:t>
+        <w:t>SQL (MySQL, SQL Server), Power BI (DAX, Power Query), Tableau, Excel</w:t>
       </w:r>
     </w:p>
     <w:p>
@@ -613,7 +613,7 @@
           <w:color w:val="5F6B7A"/>
           <w:sz w:val="18"/>
         </w:rPr>
-        <w:t xml:space="preserve">  |  SQL, DuckDB, Python, Power BI (DAX), pytest</w:t>
+        <w:t xml:space="preserve">  |  SQL, Python, Power BI (DAX), pytest</w:t>
       </w:r>
     </w:p>
     <w:p>
@@ -861,7 +861,7 @@
           <w:color w:val="5F6B7A"/>
           <w:sz w:val="18"/>
         </w:rPr>
-        <w:t xml:space="preserve">  |  Python, DuckDB, SQL, dbt, Airflow, pytest, GitHub Actions</w:t>
+        <w:t xml:space="preserve">  |  Python, SQL, dbt, Airflow, pytest, GitHub Actions</w:t>
       </w:r>
     </w:p>
     <w:p>

</xml_diff>

<commit_message>
Add the hospital readmissions project to the CV
</commit_message>
<xml_diff>
--- a/Emmanuel_Omowumi_Data_Analyst_CV.docx
+++ b/Emmanuel_Omowumi_Data_Analyst_CV.docx
@@ -124,7 +124,7 @@
           <w:color w:val="1F2933"/>
           <w:sz w:val="19"/>
         </w:rPr>
-        <w:t>Data analyst with 3+ years of experience in business intelligence, SQL reporting and dashboard development, now working in sales analytics. M.Sc. in Microbiology, with earlier experience in laboratory and quality assurance, which built a habit of validating data, tracing deviations to root cause and reporting clearly to management. Builds end-to-end analytics projects on Nigerian data (inflation, payments, distribution, customer reviews) and Power BI case studies in retail and HR, with tested code, stated limitations and costed recommendations a decision-maker can act on.</w:t>
+        <w:t>Data analyst with 3+ years of experience in business intelligence, SQL reporting and dashboard development, now working in sales analytics. M.Sc. in Microbiology, with earlier experience in laboratory and quality assurance, which built a habit of validating data, tracing deviations to root cause and reporting clearly to management. Builds end-to-end analytics projects on Nigerian data (inflation, payments, distribution, customer reviews) and Power BI case studies in retail and HR and a healthcare readmissions analysis on real Medicare data, with tested code, stated limitations and costed recommendations a decision-maker can act on.</w:t>
       </w:r>
     </w:p>
     <w:p>
@@ -232,7 +232,7 @@
         <w:rPr>
           <w:sz w:val="19"/>
         </w:rPr>
-        <w:t>Sales analytics, fintech (payments, fraud, lending), FMCG distribution, quality assurance</w:t>
+        <w:t>Sales analytics, healthcare analytics, fintech (payments, fraud, lending), FMCG distribution, quality assurance</w:t>
       </w:r>
     </w:p>
     <w:p>
@@ -517,7 +517,7 @@
           <w:color w:val="5F6B7A"/>
           <w:sz w:val="18"/>
         </w:rPr>
-        <w:t>Portfolio of 10 projects with code, tests and write-ups: github.com/Nuelwumi2024</w:t>
+        <w:t>Portfolio of 11 projects with code, tests and write-ups: github.com/Nuelwumi2024</w:t>
       </w:r>
     </w:p>
     <w:p>
@@ -853,6 +853,68 @@
           <w:b/>
           <w:sz w:val="20"/>
         </w:rPr>
+        <w:t>Hospital Readmissions Analysis (real CMS Medicare data)</w:t>
+      </w:r>
+      <w:r>
+        <w:rPr>
+          <w:i/>
+          <w:color w:val="5F6B7A"/>
+          <w:sz w:val="18"/>
+        </w:rPr>
+        <w:t xml:space="preserve">  |  Python, pandas, Matplotlib, Power BI (DAX)</w:t>
+      </w:r>
+    </w:p>
+    <w:p>
+      <w:pPr>
+        <w:pStyle w:val="ListBullet"/>
+        <w:spacing w:after="30"/>
+        <w:ind w:left="312" w:hanging="227"/>
+      </w:pPr>
+      <w:r>
+        <w:rPr>
+          <w:sz w:val="19"/>
+        </w:rPr>
+        <w:t>Pulled the CMS Hospital Readmissions Reduction Program data through its public API (3,055 hospitals, 11,720 reported results) and estimated excess readmissions by condition, state and hospital.</w:t>
+      </w:r>
+    </w:p>
+    <w:p>
+      <w:pPr>
+        <w:pStyle w:val="ListBullet"/>
+        <w:spacing w:after="30"/>
+        <w:ind w:left="312" w:hanging="227"/>
+      </w:pPr>
+      <w:r>
+        <w:rPr>
+          <w:sz w:val="19"/>
+        </w:rPr>
+        <w:t>Found that heart failure and pneumonia drive 77% of excess readmissions, and that 561 hospitals (23.5%) worse than benchmark on at least 75% of their conditions generate 49% of it; a shuffle test showed this persistence is not chance.</w:t>
+      </w:r>
+    </w:p>
+    <w:p>
+      <w:pPr>
+        <w:ind w:left="85"/>
+      </w:pPr>
+      <w:hyperlink r:id="rId17">
+        <w:r>
+          <w:rPr>
+            <w:rFonts w:ascii="Calibri" w:hAnsi="Calibri"/>
+            <w:color w:val="1F4E79"/>
+            <w:sz w:val="17"/>
+          </w:rPr>
+          <w:t xml:space="preserve">github.com/Nuelwumi2024/hospital-readmissions-analysis</w:t>
+        </w:r>
+      </w:hyperlink>
+    </w:p>
+    <w:p>
+      <w:pPr>
+        <w:keepNext/>
+        <w:spacing w:before="60" w:after="0"/>
+      </w:pPr>
+      <w:r>
+        <w:rPr>
+          <w:b/>
+          <w:sz w:val="20"/>
+        </w:rPr>
         <w:t>Data Engineering Projects (synthetic data)</w:t>
       </w:r>
       <w:r>
@@ -894,7 +956,7 @@
       <w:pPr>
         <w:ind w:left="85"/>
       </w:pPr>
-      <w:hyperlink r:id="rId17">
+      <w:hyperlink r:id="rId18">
         <w:r>
           <w:rPr>
             <w:rFonts w:ascii="Calibri" w:hAnsi="Calibri"/>

</xml_diff>